<commit_message>
paper(cai): use laminate configurations in display labels
</commit_message>
<xml_diff>
--- a/paper_cai_aei/r3_positive_review_r1/build/manuscript_bilingual.docx
+++ b/paper_cai_aei/r3_positive_review_r1/build/manuscript_bilingual.docx
@@ -10311,28 +10311,16 @@
         <w:tblLook w:firstRow="1" w:lastRow="0" w:firstColumn="0" w:lastColumn="0" w:noHBand="0" w:noVBand="0" w:val="0020"/>
       </w:tblPr>
       <w:tblGrid>
-        <w:gridCol w:w="1320"/>
-        <w:gridCol w:w="1320"/>
-        <w:gridCol w:w="1320"/>
-        <w:gridCol w:w="1320"/>
-        <w:gridCol w:w="1320"/>
-        <w:gridCol w:w="1320"/>
+        <w:gridCol w:w="1584"/>
+        <w:gridCol w:w="1584"/>
+        <w:gridCol w:w="1584"/>
+        <w:gridCol w:w="1584"/>
+        <w:gridCol w:w="1584"/>
       </w:tblGrid>
       <w:tr>
         <w:trPr>
           <w:tblHeader w:val="on"/>
         </w:trPr>
-        <w:tc>
-          <w:tcPr/>
-          <w:p>
-            <w:pPr>
-              <w:pStyle w:val="Compact"/>
-            </w:pPr>
-            <w:r>
-              <w:t xml:space="preserve">Source</w:t>
-            </w:r>
-          </w:p>
-        </w:tc>
         <w:tc>
           <w:tcPr/>
           <w:p>
@@ -10397,17 +10385,6 @@
               <w:pStyle w:val="Compact"/>
             </w:pPr>
             <w:r>
-              <w:t xml:space="preserve">74t7kcdgkr</w:t>
-            </w:r>
-          </w:p>
-        </w:tc>
-        <w:tc>
-          <w:tcPr/>
-          <w:p>
-            <w:pPr>
-              <w:pStyle w:val="Compact"/>
-            </w:pPr>
-            <w:r>
               <w:t xml:space="preserve">8-layer cross-ply</w:t>
             </w:r>
           </w:p>
@@ -10458,17 +10435,6 @@
         </w:tc>
       </w:tr>
       <w:tr>
-        <w:tc>
-          <w:tcPr/>
-          <w:p>
-            <w:pPr>
-              <w:pStyle w:val="Compact"/>
-            </w:pPr>
-            <w:r>
-              <w:t xml:space="preserve">cgtnjyggtm</w:t>
-            </w:r>
-          </w:p>
-        </w:tc>
         <w:tc>
           <w:tcPr/>
           <w:p>
@@ -10533,17 +10499,6 @@
               <w:pStyle w:val="Compact"/>
             </w:pPr>
             <w:r>
-              <w:t xml:space="preserve">w68dtmpfyf</w:t>
-            </w:r>
-          </w:p>
-        </w:tc>
-        <w:tc>
-          <w:tcPr/>
-          <w:p>
-            <w:pPr>
-              <w:pStyle w:val="Compact"/>
-            </w:pPr>
-            <w:r>
               <w:t xml:space="preserve">16-layer quasi-isotropic</w:t>
             </w:r>
           </w:p>
@@ -10594,17 +10549,6 @@
         </w:tc>
       </w:tr>
       <w:tr>
-        <w:tc>
-          <w:tcPr/>
-          <w:p>
-            <w:pPr>
-              <w:pStyle w:val="Compact"/>
-            </w:pPr>
-            <w:r>
-              <w:t xml:space="preserve">xcmzfsbd9t</w:t>
-            </w:r>
-          </w:p>
-        </w:tc>
         <w:tc>
           <w:tcPr/>
           <w:p>
@@ -10669,17 +10613,6 @@
               <w:pStyle w:val="Compact"/>
             </w:pPr>
             <w:r>
-              <w:t xml:space="preserve">yfxyg8jm46</w:t>
-            </w:r>
-          </w:p>
-        </w:tc>
-        <w:tc>
-          <w:tcPr/>
-          <w:p>
-            <w:pPr>
-              <w:pStyle w:val="Compact"/>
-            </w:pPr>
-            <w:r>
               <w:t xml:space="preserve">16-layer cross-ply</w:t>
             </w:r>
           </w:p>
@@ -10730,17 +10663,6 @@
         </w:tc>
       </w:tr>
       <w:tr>
-        <w:tc>
-          <w:tcPr/>
-          <w:p>
-            <w:pPr>
-              <w:pStyle w:val="Compact"/>
-            </w:pPr>
-            <w:r>
-              <w:t xml:space="preserve">ykhs7s2dck</w:t>
-            </w:r>
-          </w:p>
-        </w:tc>
         <w:tc>
           <w:tcPr/>
           <w:p>
@@ -10807,14 +10729,6 @@
             <w:r>
               <w:t xml:space="preserve">Total</w:t>
             </w:r>
-          </w:p>
-        </w:tc>
-        <w:tc>
-          <w:tcPr/>
-          <w:p>
-            <w:pPr>
-              <w:pStyle w:val="Compact"/>
-            </w:pPr>
           </w:p>
         </w:tc>
         <w:tc>
@@ -17121,8 +17035,7 @@
     <w:tbl>
       <w:tblPr>
         <w:tblStyle w:val="Table"/>
-        <w:tblW w:type="pct" w:w="5000"/>
-        <w:tblLayout w:type="fixed"/>
+        <w:tblW w:type="auto" w:w="0"/>
         <w:tblLook w:firstRow="1" w:lastRow="0" w:firstColumn="0" w:lastColumn="0" w:noHBand="0" w:noVBand="0" w:val="0020"/>
       </w:tblPr>
       <w:tblGrid>
@@ -17144,7 +17057,7 @@
               <w:pStyle w:val="Compact"/>
             </w:pPr>
             <w:r>
-              <w:t xml:space="preserve">Laminate (source ID)</w:t>
+              <w:t xml:space="preserve">Laminate</w:t>
             </w:r>
           </w:p>
         </w:tc>
@@ -17212,7 +17125,7 @@
               <w:pStyle w:val="Compact"/>
             </w:pPr>
             <w:r>
-              <w:t xml:space="preserve">8-layer cross-ply (74t7kcdgkr)</w:t>
+              <w:t xml:space="preserve">8-layer cross-ply</w:t>
             </w:r>
           </w:p>
         </w:tc>
@@ -17280,7 +17193,7 @@
               <w:pStyle w:val="Compact"/>
             </w:pPr>
             <w:r>
-              <w:t xml:space="preserve">24-layer quasi-isotropic (cgtnjyggtm)</w:t>
+              <w:t xml:space="preserve">24-layer quasi-isotropic</w:t>
             </w:r>
           </w:p>
         </w:tc>
@@ -17348,7 +17261,7 @@
               <w:pStyle w:val="Compact"/>
             </w:pPr>
             <w:r>
-              <w:t xml:space="preserve">16-layer quasi-isotropic (w68dtmpfyf)</w:t>
+              <w:t xml:space="preserve">16-layer quasi-isotropic</w:t>
             </w:r>
           </w:p>
         </w:tc>
@@ -17416,7 +17329,7 @@
               <w:pStyle w:val="Compact"/>
             </w:pPr>
             <w:r>
-              <w:t xml:space="preserve">24-layer cross-ply (xcmzfsbd9t)</w:t>
+              <w:t xml:space="preserve">24-layer cross-ply</w:t>
             </w:r>
           </w:p>
         </w:tc>
@@ -17484,7 +17397,7 @@
               <w:pStyle w:val="Compact"/>
             </w:pPr>
             <w:r>
-              <w:t xml:space="preserve">16-layer cross-ply (yfxyg8jm46)</w:t>
+              <w:t xml:space="preserve">16-layer cross-ply</w:t>
             </w:r>
           </w:p>
         </w:tc>
@@ -17552,7 +17465,7 @@
               <w:pStyle w:val="Compact"/>
             </w:pPr>
             <w:r>
-              <w:t xml:space="preserve">8-layer quasi-isotropic (ykhs7s2dck)</w:t>
+              <w:t xml:space="preserve">8-layer quasi-isotropic</w:t>
             </w:r>
           </w:p>
         </w:tc>
@@ -18250,7 +18163,7 @@
       </w:r>
     </w:p>
     <w:bookmarkEnd w:id="59"/>
-    <w:bookmarkStart w:id="60" w:name="references-参考文献"/>
+    <w:bookmarkStart w:id="66" w:name="references-参考文献"/>
     <w:p>
       <w:pPr>
         <w:pStyle w:val="Heading1"/>
@@ -18342,7 +18255,21 @@
         <w:pStyle w:val="BodyText"/>
       </w:pPr>
       <w:r>
-        <w:t xml:space="preserve">[10] Saki Hasebe, Ryo Higuchi, Tomohiro Yokozeki, and Shin-ichi Takeda. Datasets on CFRP specimens after low-velocity impact tests: 8-layer cross-ply laminates. Mendeley Data, 2022, version 1. https://data.mendeley.com/datasets/74t7kcdgkr/1.</w:t>
+        <w:t xml:space="preserve">[10] Saki Hasebe, Ryo Higuchi, Tomohiro Yokozeki, and Shin-ichi Takeda. Datasets on CFRP specimens after low-velocity impact tests: 8-layer cross-ply laminates. Mendeley Data, 2022, version 1.</w:t>
+      </w:r>
+      <w:r>
+        <w:t xml:space="preserve"> </w:t>
+      </w:r>
+      <w:hyperlink r:id="rId60">
+        <w:r>
+          <w:rPr>
+            <w:rStyle w:val="Hyperlink"/>
+          </w:rPr>
+          <w:t xml:space="preserve">8-layer cross-ply dataset, version 1</w:t>
+        </w:r>
+      </w:hyperlink>
+      <w:r>
+        <w:t xml:space="preserve">.</w:t>
       </w:r>
     </w:p>
     <w:p>
@@ -18350,7 +18277,21 @@
         <w:pStyle w:val="BodyText"/>
       </w:pPr>
       <w:r>
-        <w:t xml:space="preserve">[11] Saki Hasebe, Ryo Higuchi, Tomohiro Yokozeki, and Shin-ichi Takeda. Datasets on CFRP specimens after low-velocity impact tests: 24-layer quasi-isotropic laminates. Mendeley Data, 2022, version 1. https://data.mendeley.com/datasets/cgtnjyggtm/1.</w:t>
+        <w:t xml:space="preserve">[11] Saki Hasebe, Ryo Higuchi, Tomohiro Yokozeki, and Shin-ichi Takeda. Datasets on CFRP specimens after low-velocity impact tests: 24-layer quasi-isotropic laminates. Mendeley Data, 2022, version 1.</w:t>
+      </w:r>
+      <w:r>
+        <w:t xml:space="preserve"> </w:t>
+      </w:r>
+      <w:hyperlink r:id="rId61">
+        <w:r>
+          <w:rPr>
+            <w:rStyle w:val="Hyperlink"/>
+          </w:rPr>
+          <w:t xml:space="preserve">24-layer quasi-isotropic dataset, version 1</w:t>
+        </w:r>
+      </w:hyperlink>
+      <w:r>
+        <w:t xml:space="preserve">.</w:t>
       </w:r>
     </w:p>
     <w:p>
@@ -18358,7 +18299,21 @@
         <w:pStyle w:val="BodyText"/>
       </w:pPr>
       <w:r>
-        <w:t xml:space="preserve">[12] Saki Hasebe, Ryo Higuchi, Tomohiro Yokozeki, and Shin-ichi Takeda. Datasets on CFRP specimens after low-velocity impact tests: 16-layer quasi-isotropic laminates. Mendeley Data, 2022, version 1. https://data.mendeley.com/datasets/w68dtmpfyf/1.</w:t>
+        <w:t xml:space="preserve">[12] Saki Hasebe, Ryo Higuchi, Tomohiro Yokozeki, and Shin-ichi Takeda. Datasets on CFRP specimens after low-velocity impact tests: 16-layer quasi-isotropic laminates. Mendeley Data, 2022, version 1.</w:t>
+      </w:r>
+      <w:r>
+        <w:t xml:space="preserve"> </w:t>
+      </w:r>
+      <w:hyperlink r:id="rId62">
+        <w:r>
+          <w:rPr>
+            <w:rStyle w:val="Hyperlink"/>
+          </w:rPr>
+          <w:t xml:space="preserve">16-layer quasi-isotropic dataset, version 1</w:t>
+        </w:r>
+      </w:hyperlink>
+      <w:r>
+        <w:t xml:space="preserve">.</w:t>
       </w:r>
     </w:p>
     <w:p>
@@ -18366,7 +18321,21 @@
         <w:pStyle w:val="BodyText"/>
       </w:pPr>
       <w:r>
-        <w:t xml:space="preserve">[13] Saki Hasebe, Ryo Higuchi, Tomohiro Yokozeki, and Shin-ichi Takeda. Datasets on CFRP specimens after low-velocity impact tests: 24-layer cross-ply laminates. Mendeley Data, 2022, version 1. https://data.mendeley.com/datasets/xcmzfsbd9t/1.</w:t>
+        <w:t xml:space="preserve">[13] Saki Hasebe, Ryo Higuchi, Tomohiro Yokozeki, and Shin-ichi Takeda. Datasets on CFRP specimens after low-velocity impact tests: 24-layer cross-ply laminates. Mendeley Data, 2022, version 1.</w:t>
+      </w:r>
+      <w:r>
+        <w:t xml:space="preserve"> </w:t>
+      </w:r>
+      <w:hyperlink r:id="rId63">
+        <w:r>
+          <w:rPr>
+            <w:rStyle w:val="Hyperlink"/>
+          </w:rPr>
+          <w:t xml:space="preserve">24-layer cross-ply dataset, version 1</w:t>
+        </w:r>
+      </w:hyperlink>
+      <w:r>
+        <w:t xml:space="preserve">.</w:t>
       </w:r>
     </w:p>
     <w:p>
@@ -18374,7 +18343,21 @@
         <w:pStyle w:val="BodyText"/>
       </w:pPr>
       <w:r>
-        <w:t xml:space="preserve">[14] Saki Hasebe, Ryo Higuchi, Tomohiro Yokozeki, and Shin-ichi Takeda. Datasets on CFRP specimens after low-velocity impact tests: 16-layer cross-ply laminates. Mendeley Data, 2022, version 1. https://data.mendeley.com/datasets/yfxyg8jm46/1.</w:t>
+        <w:t xml:space="preserve">[14] Saki Hasebe, Ryo Higuchi, Tomohiro Yokozeki, and Shin-ichi Takeda. Datasets on CFRP specimens after low-velocity impact tests: 16-layer cross-ply laminates. Mendeley Data, 2022, version 1.</w:t>
+      </w:r>
+      <w:r>
+        <w:t xml:space="preserve"> </w:t>
+      </w:r>
+      <w:hyperlink r:id="rId64">
+        <w:r>
+          <w:rPr>
+            <w:rStyle w:val="Hyperlink"/>
+          </w:rPr>
+          <w:t xml:space="preserve">16-layer cross-ply dataset, version 1</w:t>
+        </w:r>
+      </w:hyperlink>
+      <w:r>
+        <w:t xml:space="preserve">.</w:t>
       </w:r>
     </w:p>
     <w:p>
@@ -18382,10 +18365,24 @@
         <w:pStyle w:val="BodyText"/>
       </w:pPr>
       <w:r>
-        <w:t xml:space="preserve">[15] Saki Hasebe, Ryo Higuchi, Tomohiro Yokozeki, and Shin-ichi Takeda. Datasets on CFRP specimens after low-velocity impact tests: 8-layer quasi-isotropic laminates. Mendeley Data, 2022, version 1. https://data.mendeley.com/datasets/ykhs7s2dck/1.</w:t>
-      </w:r>
-    </w:p>
-    <w:bookmarkEnd w:id="60"/>
+        <w:t xml:space="preserve">[15] Saki Hasebe, Ryo Higuchi, Tomohiro Yokozeki, and Shin-ichi Takeda. Datasets on CFRP specimens after low-velocity impact tests: 8-layer quasi-isotropic laminates. Mendeley Data, 2022, version 1.</w:t>
+      </w:r>
+      <w:r>
+        <w:t xml:space="preserve"> </w:t>
+      </w:r>
+      <w:hyperlink r:id="rId65">
+        <w:r>
+          <w:rPr>
+            <w:rStyle w:val="Hyperlink"/>
+          </w:rPr>
+          <w:t xml:space="preserve">8-layer quasi-isotropic dataset, version 1</w:t>
+        </w:r>
+      </w:hyperlink>
+      <w:r>
+        <w:t xml:space="preserve">.</w:t>
+      </w:r>
+    </w:p>
+    <w:bookmarkEnd w:id="66"/>
     <w:sectPr>
       <w:footnotePr>
         <w:numRestart w:val="eachSect"/>

</xml_diff>